<commit_message>
updated readme and docs
</commit_message>
<xml_diff>
--- a/docs/Growise_SmartReco_Project_Documentation.docx
+++ b/docs/Growise_SmartReco_Project_Documentation.docx
@@ -223,9 +223,6 @@
             </w:r>
           </w:p>
         </w:tc>
-        <w:trPr>
-          <w:tblHeader/>
-        </w:trPr>
       </w:tr>
     </w:tbl>
     <w:p>
@@ -425,9 +422,6 @@
             </w:r>
           </w:p>
         </w:tc>
-        <w:trPr>
-          <w:tblHeader/>
-        </w:trPr>
       </w:tr>
       <w:tr>
         <w:tc>
@@ -656,7 +650,7 @@
         <w:drawing>
           <wp:inline xmlns:a="http://schemas.openxmlformats.org/drawingml/2006/main" xmlns:pic="http://schemas.openxmlformats.org/drawingml/2006/picture">
             <wp:extent cx="5532120" cy="3011932"/>
-            <wp:docPr id="1" name="Picture 1" descr="Image: image1.png"/>
+            <wp:docPr id="1" name="Picture 1"/>
             <wp:cNvGraphicFramePr>
               <a:graphicFrameLocks noChangeAspect="1"/>
             </wp:cNvGraphicFramePr>
@@ -828,9 +822,6 @@
             </w:r>
           </w:p>
         </w:tc>
-        <w:trPr>
-          <w:tblHeader/>
-        </w:trPr>
       </w:tr>
       <w:tr>
         <w:tc>
@@ -980,7 +971,7 @@
                 <w:color w:val="18202B"/>
                 <w:sz w:val="17"/>
               </w:rPr>
-              <w:t>SQL store</w:t>
+              <w:t>Neon PostgreSQL</w:t>
             </w:r>
           </w:p>
         </w:tc>
@@ -1022,7 +1013,7 @@
                 <w:color w:val="18202B"/>
                 <w:sz w:val="17"/>
               </w:rPr>
-              <w:t>SQLAlchemy entities and durable recommendation history.</w:t>
+              <w:t>SQLAlchemy entities, SSL-enabled Neon connection and durable recommendation history.</w:t>
             </w:r>
           </w:p>
         </w:tc>
@@ -1192,7 +1183,7 @@
         <w:drawing>
           <wp:inline xmlns:a="http://schemas.openxmlformats.org/drawingml/2006/main" xmlns:pic="http://schemas.openxmlformats.org/drawingml/2006/picture">
             <wp:extent cx="5532120" cy="2581656"/>
-            <wp:docPr id="2" name="Picture 2" descr="Image: image2.png"/>
+            <wp:docPr id="2" name="Picture 2"/>
             <wp:cNvGraphicFramePr>
               <a:graphicFrameLocks noChangeAspect="1"/>
             </wp:cNvGraphicFramePr>
@@ -1302,7 +1293,7 @@
         <w:drawing>
           <wp:inline xmlns:a="http://schemas.openxmlformats.org/drawingml/2006/main" xmlns:pic="http://schemas.openxmlformats.org/drawingml/2006/picture">
             <wp:extent cx="5532120" cy="2766060"/>
-            <wp:docPr id="3" name="Picture 3" descr="Image: image3.png"/>
+            <wp:docPr id="3" name="Picture 3"/>
             <wp:cNvGraphicFramePr>
               <a:graphicFrameLocks noChangeAspect="1"/>
             </wp:cNvGraphicFramePr>
@@ -1490,9 +1481,6 @@
             </w:r>
           </w:p>
         </w:tc>
-        <w:trPr>
-          <w:tblHeader/>
-        </w:trPr>
       </w:tr>
       <w:tr>
         <w:tc>
@@ -1923,7 +1911,7 @@
         <w:drawing>
           <wp:inline xmlns:a="http://schemas.openxmlformats.org/drawingml/2006/main" xmlns:pic="http://schemas.openxmlformats.org/drawingml/2006/picture">
             <wp:extent cx="5532120" cy="5272802"/>
-            <wp:docPr id="4" name="Picture 4" descr="Image: image4.jpg"/>
+            <wp:docPr id="4" name="Picture 4"/>
             <wp:cNvGraphicFramePr>
               <a:graphicFrameLocks noChangeAspect="1"/>
             </wp:cNvGraphicFramePr>
@@ -1999,7 +1987,7 @@
         <w:drawing>
           <wp:inline xmlns:a="http://schemas.openxmlformats.org/drawingml/2006/main" xmlns:pic="http://schemas.openxmlformats.org/drawingml/2006/picture">
             <wp:extent cx="5532120" cy="3301984"/>
-            <wp:docPr id="5" name="Picture 5" descr="Image: image5.jpg"/>
+            <wp:docPr id="5" name="Picture 5"/>
             <wp:cNvGraphicFramePr>
               <a:graphicFrameLocks noChangeAspect="1"/>
             </wp:cNvGraphicFramePr>
@@ -2075,7 +2063,7 @@
         <w:drawing>
           <wp:inline xmlns:a="http://schemas.openxmlformats.org/drawingml/2006/main" xmlns:pic="http://schemas.openxmlformats.org/drawingml/2006/picture">
             <wp:extent cx="5532120" cy="3902738"/>
-            <wp:docPr id="6" name="Picture 6" descr="Image: image6.jpg"/>
+            <wp:docPr id="6" name="Picture 6"/>
             <wp:cNvGraphicFramePr>
               <a:graphicFrameLocks noChangeAspect="1"/>
             </wp:cNvGraphicFramePr>
@@ -2151,7 +2139,7 @@
         <w:drawing>
           <wp:inline xmlns:a="http://schemas.openxmlformats.org/drawingml/2006/main" xmlns:pic="http://schemas.openxmlformats.org/drawingml/2006/picture">
             <wp:extent cx="5532120" cy="3111818"/>
-            <wp:docPr id="7" name="Picture 7" descr="Image: image7.jpg"/>
+            <wp:docPr id="7" name="Picture 7"/>
             <wp:cNvGraphicFramePr>
               <a:graphicFrameLocks noChangeAspect="1"/>
             </wp:cNvGraphicFramePr>
@@ -2227,7 +2215,7 @@
         <w:drawing>
           <wp:inline xmlns:a="http://schemas.openxmlformats.org/drawingml/2006/main" xmlns:pic="http://schemas.openxmlformats.org/drawingml/2006/picture">
             <wp:extent cx="5532120" cy="4538067"/>
-            <wp:docPr id="8" name="Picture 8" descr="Image: image8.jpg"/>
+            <wp:docPr id="8" name="Picture 8"/>
             <wp:cNvGraphicFramePr>
               <a:graphicFrameLocks noChangeAspect="1"/>
             </wp:cNvGraphicFramePr>
@@ -2303,7 +2291,7 @@
         <w:drawing>
           <wp:inline xmlns:a="http://schemas.openxmlformats.org/drawingml/2006/main" xmlns:pic="http://schemas.openxmlformats.org/drawingml/2006/picture">
             <wp:extent cx="5532120" cy="4538067"/>
-            <wp:docPr id="9" name="Picture 9" descr="Image: image9.jpg"/>
+            <wp:docPr id="9" name="Picture 9"/>
             <wp:cNvGraphicFramePr>
               <a:graphicFrameLocks noChangeAspect="1"/>
             </wp:cNvGraphicFramePr>
@@ -2379,7 +2367,7 @@
         <w:drawing>
           <wp:inline xmlns:a="http://schemas.openxmlformats.org/drawingml/2006/main" xmlns:pic="http://schemas.openxmlformats.org/drawingml/2006/picture">
             <wp:extent cx="5532120" cy="4538067"/>
-            <wp:docPr id="10" name="Picture 10" descr="Image: image10.jpg"/>
+            <wp:docPr id="10" name="Picture 10"/>
             <wp:cNvGraphicFramePr>
               <a:graphicFrameLocks noChangeAspect="1"/>
             </wp:cNvGraphicFramePr>
@@ -2495,7 +2483,7 @@
         <w:drawing>
           <wp:inline xmlns:a="http://schemas.openxmlformats.org/drawingml/2006/main" xmlns:pic="http://schemas.openxmlformats.org/drawingml/2006/picture">
             <wp:extent cx="5532120" cy="3902738"/>
-            <wp:docPr id="11" name="Picture 11" descr="Image: image11.jpg"/>
+            <wp:docPr id="11" name="Picture 11"/>
             <wp:cNvGraphicFramePr>
               <a:graphicFrameLocks noChangeAspect="1"/>
             </wp:cNvGraphicFramePr>
@@ -2571,7 +2559,7 @@
         <w:drawing>
           <wp:inline xmlns:a="http://schemas.openxmlformats.org/drawingml/2006/main" xmlns:pic="http://schemas.openxmlformats.org/drawingml/2006/picture">
             <wp:extent cx="5532120" cy="4149090"/>
-            <wp:docPr id="12" name="Picture 12" descr="Image: image12.jpg"/>
+            <wp:docPr id="12" name="Picture 12"/>
             <wp:cNvGraphicFramePr>
               <a:graphicFrameLocks noChangeAspect="1"/>
             </wp:cNvGraphicFramePr>
@@ -2647,7 +2635,7 @@
         <w:drawing>
           <wp:inline xmlns:a="http://schemas.openxmlformats.org/drawingml/2006/main" xmlns:pic="http://schemas.openxmlformats.org/drawingml/2006/picture">
             <wp:extent cx="5532120" cy="4105870"/>
-            <wp:docPr id="13" name="Picture 13" descr="Image: image13.jpg"/>
+            <wp:docPr id="13" name="Picture 13"/>
             <wp:cNvGraphicFramePr>
               <a:graphicFrameLocks noChangeAspect="1"/>
             </wp:cNvGraphicFramePr>
@@ -2723,7 +2711,7 @@
         <w:drawing>
           <wp:inline xmlns:a="http://schemas.openxmlformats.org/drawingml/2006/main" xmlns:pic="http://schemas.openxmlformats.org/drawingml/2006/picture">
             <wp:extent cx="5532120" cy="4754166"/>
-            <wp:docPr id="14" name="Picture 14" descr="Image: image14.jpg"/>
+            <wp:docPr id="14" name="Picture 14"/>
             <wp:cNvGraphicFramePr>
               <a:graphicFrameLocks noChangeAspect="1"/>
             </wp:cNvGraphicFramePr>
@@ -2799,7 +2787,7 @@
         <w:drawing>
           <wp:inline xmlns:a="http://schemas.openxmlformats.org/drawingml/2006/main" xmlns:pic="http://schemas.openxmlformats.org/drawingml/2006/picture">
             <wp:extent cx="5532120" cy="3111818"/>
-            <wp:docPr id="15" name="Picture 15" descr="Image: image15.jpg"/>
+            <wp:docPr id="15" name="Picture 15"/>
             <wp:cNvGraphicFramePr>
               <a:graphicFrameLocks noChangeAspect="1"/>
             </wp:cNvGraphicFramePr>
@@ -2875,7 +2863,7 @@
         <w:drawing>
           <wp:inline xmlns:a="http://schemas.openxmlformats.org/drawingml/2006/main" xmlns:pic="http://schemas.openxmlformats.org/drawingml/2006/picture">
             <wp:extent cx="5532120" cy="3755791"/>
-            <wp:docPr id="16" name="Picture 16" descr="Image: image16.jpg"/>
+            <wp:docPr id="16" name="Picture 16"/>
             <wp:cNvGraphicFramePr>
               <a:graphicFrameLocks noChangeAspect="1"/>
             </wp:cNvGraphicFramePr>
@@ -3083,9 +3071,6 @@
             </w:r>
           </w:p>
         </w:tc>
-        <w:trPr>
-          <w:tblHeader/>
-        </w:trPr>
       </w:tr>
       <w:tr>
         <w:tc>

</xml_diff>